<commit_message>
Add idx_stage schema documentation and update all MLS DB docs
Add comprehensive documentation for the idx_stage pre-staging schema
covering naming conventions (ps_{type}_{resource}_{source_id}),
all-text column design, and data flow. Update README, overview, and
regenerate both DOCX files to include idx_stage as 5th schema.

Co-Authored-By: Claude Opus 4.6 <noreply@anthropic.com>
Claude-Session: https://claude.ai/code/session_01ATXSXcST8j6vMuP2vFMWSc
</commit_message>
<xml_diff>
--- a/docs/mls-database/MLS_Database_Overview.docx
+++ b/docs/mls-database/MLS_Database_Overview.docx
@@ -523,7 +523,21 @@
               <w:rPr>
                 <w:sz w:val="18"/>
               </w:rPr>
-              <w:t>36 (across 4 documented schemas)</w:t>
+              <w:t>36 (named) + hundreds of pre-staging tables (</w:t>
+            </w:r>
+            <w:r>
+              <w:rPr>
+                <w:rFonts w:ascii="Consolas" w:hAnsi="Consolas"/>
+                <w:color w:val="6A0DAD"/>
+                <w:sz w:val="18"/>
+              </w:rPr>
+              <w:t>idx_stage</w:t>
+            </w:r>
+            <w:r>
+              <w:rPr>
+                <w:sz w:val="18"/>
+              </w:rPr>
+              <w:t>)</w:t>
             </w:r>
           </w:p>
         </w:tc>
@@ -892,11 +906,15 @@
         <w:br/>
         <w:t xml:space="preserve">         ▼</w:t>
         <w:br/>
-        <w:t>┌─────────────────────┐</w:t>
+        <w:t>┌──────────────────────────────────────────────────────┐</w:t>
         <w:br/>
-        <w:t>│   idx_stage.*       │  ← Raw Data Staging (per-source staging tables)</w:t>
+        <w:t>│   idx_stage.*                                        │  ← Pre-Staging</w:t>
         <w:br/>
-        <w:t>└────────┬────────────┘</w:t>
+        <w:t>│   ps_{source_type}_{resource_name}_{source_id}       │     (all text columns)</w:t>
+        <w:br/>
+        <w:t>│   ps_rets_{resource_name}_{source_id}                │     (one table per source/resource)</w:t>
+        <w:br/>
+        <w:t>└────────────────────────┬─────────────────────────────┘</w:t>
         <w:br/>
         <w:t xml:space="preserve">         │</w:t>
         <w:br/>
@@ -1021,10 +1039,10 @@
         <w:rPr>
           <w:b/>
         </w:rPr>
-        <w:t>Data Staging</w:t>
-      </w:r>
-      <w:r>
-        <w:t xml:space="preserve"> — Raw listing data from MLS feeds is staged in </w:t>
+        <w:t>Pre-Staging</w:t>
+      </w:r>
+      <w:r>
+        <w:t xml:space="preserve"> — Raw data is downloaded from MLS sources into </w:t>
       </w:r>
       <w:r>
         <w:rPr>
@@ -1035,7 +1053,40 @@
         <w:t>idx_stage</w:t>
       </w:r>
       <w:r>
-        <w:t xml:space="preserve"> schema tables (one table per source/resource combination). This staging layer buffers incoming data before transformation.</w:t>
+        <w:t xml:space="preserve"> pre-staging tables. Each source/resource combination gets its own table following the naming convention </w:t>
+      </w:r>
+      <w:r>
+        <w:rPr>
+          <w:rFonts w:ascii="Consolas" w:hAnsi="Consolas"/>
+          <w:color w:val="6A0DAD"/>
+          <w:sz w:val="18"/>
+        </w:rPr>
+        <w:t>ps_{source_type}_{resource_name}_{source_id}</w:t>
+      </w:r>
+      <w:r>
+        <w:t xml:space="preserve"> (for APIs) or </w:t>
+      </w:r>
+      <w:r>
+        <w:rPr>
+          <w:rFonts w:ascii="Consolas" w:hAnsi="Consolas"/>
+          <w:color w:val="6A0DAD"/>
+          <w:sz w:val="18"/>
+        </w:rPr>
+        <w:t>ps_rets_{resource_name}_{source_id}</w:t>
+      </w:r>
+      <w:r>
+        <w:t xml:space="preserve"> (for RETS). All columns use the </w:t>
+      </w:r>
+      <w:r>
+        <w:rPr>
+          <w:rFonts w:ascii="Consolas" w:hAnsi="Consolas"/>
+          <w:color w:val="6A0DAD"/>
+          <w:sz w:val="18"/>
+        </w:rPr>
+        <w:t>text</w:t>
+      </w:r>
+      <w:r>
+        <w:t xml:space="preserve"> data type to prevent type-casting failures during download — transformation happens later.</w:t>
       </w:r>
     </w:p>
     <w:p>
@@ -3713,7 +3764,7 @@
         <w:pStyle w:val="Heading3"/>
       </w:pPr>
       <w:r>
-        <w:t>3.5 idx_stage Schema — Data Staging (pending)</w:t>
+        <w:t>3.5 idx_stage Schema — Pre-Staging Raw Data (hundreds of tables)</w:t>
       </w:r>
     </w:p>
     <w:p>
@@ -3729,16 +3780,246 @@
         <w:t>idx_stage</w:t>
       </w:r>
       <w:r>
-        <w:t xml:space="preserve"> schema contains </w:t>
+        <w:t xml:space="preserve"> schema is the </w:t>
       </w:r>
       <w:r>
         <w:rPr>
           <w:b/>
         </w:rPr>
-        <w:t>raw staging tables</w:t>
-      </w:r>
-      <w:r>
-        <w:t xml:space="preserve"> for MLS data ingestion. Its metadata (~47MB) suggests a large number of tables, likely one per MLS source/resource combination. Documentation will be added when metadata is available.</w:t>
+        <w:t>first landing zone</w:t>
+      </w:r>
+      <w:r>
+        <w:t xml:space="preserve"> for MLS data. It contains hundreds of pre-staging tables — one per source/resource combination — that hold raw data exactly as downloaded from MLS sources.</w:t>
+      </w:r>
+    </w:p>
+    <w:p>
+      <w:r>
+        <w:rPr>
+          <w:b/>
+        </w:rPr>
+        <w:t>Naming Convention:</w:t>
+      </w:r>
+    </w:p>
+    <w:p>
+      <w:pPr>
+        <w:pStyle w:val="ListBullet"/>
+      </w:pPr>
+      <w:r>
+        <w:t xml:space="preserve">API sources: </w:t>
+      </w:r>
+      <w:r>
+        <w:rPr>
+          <w:rFonts w:ascii="Consolas" w:hAnsi="Consolas"/>
+          <w:color w:val="6A0DAD"/>
+          <w:sz w:val="18"/>
+        </w:rPr>
+        <w:t>ps_{source_type}_{resource_name}_{source_id}</w:t>
+      </w:r>
+      <w:r>
+        <w:t xml:space="preserve"> (e.g., </w:t>
+      </w:r>
+      <w:r>
+        <w:rPr>
+          <w:rFonts w:ascii="Consolas" w:hAnsi="Consolas"/>
+          <w:color w:val="6A0DAD"/>
+          <w:sz w:val="18"/>
+        </w:rPr>
+        <w:t>ps_api_property_205</w:t>
+      </w:r>
+      <w:r>
+        <w:t>)</w:t>
+      </w:r>
+    </w:p>
+    <w:p>
+      <w:pPr>
+        <w:pStyle w:val="ListBullet"/>
+      </w:pPr>
+      <w:r>
+        <w:t xml:space="preserve">RETS sources: </w:t>
+      </w:r>
+      <w:r>
+        <w:rPr>
+          <w:rFonts w:ascii="Consolas" w:hAnsi="Consolas"/>
+          <w:color w:val="6A0DAD"/>
+          <w:sz w:val="18"/>
+        </w:rPr>
+        <w:t>ps_rets_{resource_name}_{source_id}</w:t>
+      </w:r>
+      <w:r>
+        <w:t xml:space="preserve"> (e.g., </w:t>
+      </w:r>
+      <w:r>
+        <w:rPr>
+          <w:rFonts w:ascii="Consolas" w:hAnsi="Consolas"/>
+          <w:color w:val="6A0DAD"/>
+          <w:sz w:val="18"/>
+        </w:rPr>
+        <w:t>ps_rets_property_101</w:t>
+      </w:r>
+      <w:r>
+        <w:t>)</w:t>
+      </w:r>
+    </w:p>
+    <w:p>
+      <w:r>
+        <w:rPr>
+          <w:b/>
+        </w:rPr>
+        <w:t>Key Design Decisions:</w:t>
+      </w:r>
+    </w:p>
+    <w:p>
+      <w:pPr>
+        <w:pStyle w:val="ListBullet"/>
+      </w:pPr>
+      <w:r>
+        <w:rPr>
+          <w:b/>
+        </w:rPr>
+        <w:t>All columns are `text`</w:t>
+      </w:r>
+      <w:r>
+        <w:t xml:space="preserve"> — No type casting during download; raw data is preserved with source fidelity</w:t>
+      </w:r>
+    </w:p>
+    <w:p>
+      <w:pPr>
+        <w:pStyle w:val="ListBullet"/>
+      </w:pPr>
+      <w:r>
+        <w:rPr>
+          <w:b/>
+        </w:rPr>
+        <w:t>One table per source/resource</w:t>
+      </w:r>
+      <w:r>
+        <w:t xml:space="preserve"> — Provides isolation between sources, supports independent column sets, and enables parallel loading</w:t>
+      </w:r>
+    </w:p>
+    <w:p>
+      <w:pPr>
+        <w:pStyle w:val="ListBullet"/>
+      </w:pPr>
+      <w:r>
+        <w:rPr>
+          <w:b/>
+        </w:rPr>
+        <w:t>Convention-based naming</w:t>
+      </w:r>
+      <w:r>
+        <w:t xml:space="preserve"> — Source type, resource, and source ID are encoded in the table name itself</w:t>
+      </w:r>
+    </w:p>
+    <w:p>
+      <w:r>
+        <w:rPr>
+          <w:b/>
+        </w:rPr>
+        <w:t>Data Flow:</w:t>
+      </w:r>
+    </w:p>
+    <w:p>
+      <w:r>
+        <w:t xml:space="preserve">1. ETL scheduler creates download tasks in </w:t>
+      </w:r>
+      <w:r>
+        <w:rPr>
+          <w:rFonts w:ascii="Consolas" w:hAnsi="Consolas"/>
+          <w:color w:val="6A0DAD"/>
+          <w:sz w:val="18"/>
+        </w:rPr>
+        <w:t>dev.to_do</w:t>
+      </w:r>
+    </w:p>
+    <w:p>
+      <w:r>
+        <w:t>2. Raw data is downloaded from MLS via RETS or Web API</w:t>
+      </w:r>
+    </w:p>
+    <w:p>
+      <w:r>
+        <w:t xml:space="preserve">3. Records land in the corresponding </w:t>
+      </w:r>
+      <w:r>
+        <w:rPr>
+          <w:rFonts w:ascii="Consolas" w:hAnsi="Consolas"/>
+          <w:color w:val="6A0DAD"/>
+          <w:sz w:val="18"/>
+        </w:rPr>
+        <w:t>ps_*</w:t>
+      </w:r>
+      <w:r>
+        <w:t xml:space="preserve"> table as text</w:t>
+      </w:r>
+    </w:p>
+    <w:p>
+      <w:r>
+        <w:t xml:space="preserve">4. </w:t>
+      </w:r>
+      <w:r>
+        <w:rPr>
+          <w:rFonts w:ascii="Consolas" w:hAnsi="Consolas"/>
+          <w:color w:val="6A0DAD"/>
+          <w:sz w:val="18"/>
+        </w:rPr>
+        <w:t>etl.mappings</w:t>
+      </w:r>
+      <w:r>
+        <w:t xml:space="preserve"> defines how each column transforms into </w:t>
+      </w:r>
+      <w:r>
+        <w:rPr>
+          <w:rFonts w:ascii="Consolas" w:hAnsi="Consolas"/>
+          <w:color w:val="6A0DAD"/>
+          <w:sz w:val="18"/>
+        </w:rPr>
+        <w:t>public.*</w:t>
+      </w:r>
+      <w:r>
+        <w:t xml:space="preserve"> typed columns</w:t>
+      </w:r>
+    </w:p>
+    <w:p>
+      <w:r>
+        <w:t xml:space="preserve">5. Transformed data moves to </w:t>
+      </w:r>
+      <w:r>
+        <w:rPr>
+          <w:rFonts w:ascii="Consolas" w:hAnsi="Consolas"/>
+          <w:color w:val="6A0DAD"/>
+          <w:sz w:val="18"/>
+        </w:rPr>
+        <w:t>public.listing</w:t>
+      </w:r>
+      <w:r>
+        <w:t xml:space="preserve">, </w:t>
+      </w:r>
+      <w:r>
+        <w:rPr>
+          <w:rFonts w:ascii="Consolas" w:hAnsi="Consolas"/>
+          <w:color w:val="6A0DAD"/>
+          <w:sz w:val="18"/>
+        </w:rPr>
+        <w:t>real_estate_participant</w:t>
+      </w:r>
+      <w:r>
+        <w:t>, etc.</w:t>
+      </w:r>
+    </w:p>
+    <w:p>
+      <w:r>
+        <w:t xml:space="preserve">The 47MB metadata file size reflects the large number of tables, each with potentially hundreds of text columns matching the MLS field definitions from </w:t>
+      </w:r>
+      <w:r>
+        <w:rPr>
+          <w:rFonts w:ascii="Consolas" w:hAnsi="Consolas"/>
+          <w:color w:val="6A0DAD"/>
+          <w:sz w:val="18"/>
+        </w:rPr>
+        <w:t>dev.field_metadata</w:t>
+      </w:r>
+      <w:r>
+        <w:t>.</w:t>
       </w:r>
     </w:p>
     <w:p>
@@ -3939,13 +4220,27 @@
                 <w:color w:val="6A0DAD"/>
                 <w:sz w:val="18"/>
               </w:rPr>
-              <w:t xml:space="preserve">, </w:t>
-            </w:r>
-            <w:r>
-              <w:rPr>
-                <w:sz w:val="18"/>
-              </w:rPr>
-              <w:t>resource_name` drive staging table selection</w:t>
+              <w:t xml:space="preserve"> and </w:t>
+            </w:r>
+            <w:r>
+              <w:rPr>
+                <w:sz w:val="18"/>
+              </w:rPr>
+              <w:t>resource_name</w:t>
+            </w:r>
+            <w:r>
+              <w:rPr>
+                <w:rFonts w:ascii="Consolas" w:hAnsi="Consolas"/>
+                <w:color w:val="6A0DAD"/>
+                <w:sz w:val="18"/>
+              </w:rPr>
+              <w:t xml:space="preserve"> determine the </w:t>
+            </w:r>
+            <w:r>
+              <w:rPr>
+                <w:sz w:val="18"/>
+              </w:rPr>
+              <w:t>ps_*` table name</w:t>
             </w:r>
           </w:p>
         </w:tc>
@@ -3978,7 +4273,7 @@
               <w:rPr>
                 <w:sz w:val="18"/>
               </w:rPr>
-              <w:t>etl</w:t>
+              <w:t>idx_stage</w:t>
             </w:r>
             <w:r>
               <w:rPr>
@@ -4011,7 +4306,7 @@
               <w:rPr>
                 <w:sz w:val="18"/>
               </w:rPr>
-              <w:t>mappings</w:t>
+              <w:t>etl.mappings.source_table</w:t>
             </w:r>
             <w:r>
               <w:rPr>
@@ -4019,13 +4314,26 @@
                 <w:color w:val="6A0DAD"/>
                 <w:sz w:val="18"/>
               </w:rPr>
-              <w:t xml:space="preserve"> define how staging data transforms into </w:t>
-            </w:r>
-            <w:r>
-              <w:rPr>
-                <w:sz w:val="18"/>
-              </w:rPr>
-              <w:t>public` tables</w:t>
+              <w:t xml:space="preserve"> references </w:t>
+            </w:r>
+            <w:r>
+              <w:rPr>
+                <w:sz w:val="18"/>
+              </w:rPr>
+              <w:t>ps_</w:t>
+            </w:r>
+            <w:r>
+              <w:rPr>
+                <w:i/>
+                <w:sz w:val="18"/>
+              </w:rPr>
+              <w:t>` tables; transformations produce `public.</w:t>
+            </w:r>
+            <w:r>
+              <w:rPr>
+                <w:sz w:val="18"/>
+              </w:rPr>
+              <w:t>` rows</w:t>
             </w:r>
           </w:p>
         </w:tc>
@@ -6233,7 +6541,7 @@
               <w:rPr>
                 <w:sz w:val="18"/>
               </w:rPr>
-              <w:t>36+</w:t>
+              <w:t>36 + hundreds (idx_stage)</w:t>
             </w:r>
           </w:p>
         </w:tc>

</xml_diff>